<commit_message>
fix: revisa doc de gravação na placa para NRZ-L
</commit_message>
<xml_diff>
--- a/nrz_l/docs/tutorial_placa.docx
+++ b/nrz_l/docs/tutorial_placa.docx
@@ -172,9 +172,12 @@
           <w:sz w:val="32"/>
           <w:szCs w:val="32"/>
         </w:rPr>
-        <w:t xml:space="preserve">Tutorial de </w:t>
-      </w:r>
-      <w:r>
+        <w:t>Tutorial de gravação na placa FPGA</w:t>
+      </w:r>
+    </w:p>
+    <w:p>
+      <w:pPr>
+        <w:jc w:val="center"/>
         <w:rPr>
           <w:rFonts w:ascii="Arial" w:hAnsi="Arial" w:cs="Arial"/>
           <w:b/>
@@ -182,8 +185,7 @@
           <w:sz w:val="32"/>
           <w:szCs w:val="32"/>
         </w:rPr>
-        <w:t>gravação na placa FPGA</w:t>
-      </w:r>
+      </w:pPr>
     </w:p>
     <w:p>
       <w:pPr>
@@ -319,18 +321,6 @@
     </w:p>
     <w:p>
       <w:pPr>
-        <w:jc w:val="center"/>
-        <w:rPr>
-          <w:rFonts w:ascii="Arial" w:hAnsi="Arial" w:cs="Arial"/>
-          <w:b/>
-          <w:bCs/>
-          <w:sz w:val="32"/>
-          <w:szCs w:val="32"/>
-        </w:rPr>
-      </w:pPr>
-    </w:p>
-    <w:p>
-      <w:pPr>
         <w:jc w:val="both"/>
         <w:rPr>
           <w:rFonts w:ascii="Arial" w:hAnsi="Arial" w:cs="Arial"/>
@@ -364,19 +354,19 @@
         <w:rPr>
           <w:rFonts w:ascii="Arial" w:hAnsi="Arial" w:cs="Arial"/>
         </w:rPr>
-        <w:t>Antes de</w:t>
-      </w:r>
-      <w:r>
-        <w:rPr>
-          <w:rFonts w:ascii="Arial" w:hAnsi="Arial" w:cs="Arial"/>
-        </w:rPr>
-        <w:t xml:space="preserve"> iniciar </w:t>
-      </w:r>
-      <w:r>
-        <w:rPr>
-          <w:rFonts w:ascii="Arial" w:hAnsi="Arial" w:cs="Arial"/>
-        </w:rPr>
-        <w:t>o procedimento de gravação na placa FPGA, para verificar o comportamento da modulação por meio dos Switches e LEDs do circuito, os seguintes itens são necessários:</w:t>
+        <w:t xml:space="preserve">Antes de iniciar o procedimento de gravação na placa FPGA, </w:t>
+      </w:r>
+      <w:r>
+        <w:rPr>
+          <w:rFonts w:ascii="Arial" w:hAnsi="Arial" w:cs="Arial"/>
+        </w:rPr>
+        <w:t>e</w:t>
+      </w:r>
+      <w:r>
+        <w:rPr>
+          <w:rFonts w:ascii="Arial" w:hAnsi="Arial" w:cs="Arial"/>
+        </w:rPr>
+        <w:t xml:space="preserve"> verificar o comportamento da modulação por meio dos Switches e LEDs do circuito, os seguintes itens são necessários:</w:t>
       </w:r>
     </w:p>
     <w:p>
@@ -467,49 +457,19 @@
         <w:rPr>
           <w:rFonts w:ascii="Arial" w:hAnsi="Arial" w:cs="Arial"/>
         </w:rPr>
-        <w:t xml:space="preserve">Com o projeto do Vivado aberto, localize o arquivo do Design </w:t>
-      </w:r>
-      <w:proofErr w:type="spellStart"/>
-      <w:r>
-        <w:rPr>
-          <w:rFonts w:ascii="Arial" w:hAnsi="Arial" w:cs="Arial"/>
-        </w:rPr>
-        <w:t>Source</w:t>
-      </w:r>
-      <w:proofErr w:type="spellEnd"/>
-      <w:r>
-        <w:rPr>
-          <w:rFonts w:ascii="Arial" w:hAnsi="Arial" w:cs="Arial"/>
-        </w:rPr>
-        <w:t>. Para realizar a gravação na placa corretamente, é necessário comentar duas linhas que fazem referência à variável “</w:t>
-      </w:r>
-      <w:proofErr w:type="spellStart"/>
-      <w:r>
-        <w:rPr>
-          <w:rFonts w:ascii="Arial" w:hAnsi="Arial" w:cs="Arial"/>
-        </w:rPr>
-        <w:t>saída_testbench</w:t>
-      </w:r>
-      <w:proofErr w:type="spellEnd"/>
-      <w:r>
-        <w:rPr>
-          <w:rFonts w:ascii="Arial" w:hAnsi="Arial" w:cs="Arial"/>
-        </w:rPr>
-        <w:t xml:space="preserve">”, neste caso, as linhas 13 e 38. Para comentá-las, adicione dois </w:t>
-      </w:r>
-      <w:proofErr w:type="spellStart"/>
-      <w:r>
-        <w:rPr>
-          <w:rFonts w:ascii="Arial" w:hAnsi="Arial" w:cs="Arial"/>
-        </w:rPr>
-        <w:t>hífens</w:t>
-      </w:r>
-      <w:proofErr w:type="spellEnd"/>
-      <w:r>
-        <w:rPr>
-          <w:rFonts w:ascii="Arial" w:hAnsi="Arial" w:cs="Arial"/>
-        </w:rPr>
-        <w:t xml:space="preserve"> (--) no início das linhas. Ao final, salve o arquivo.</w:t>
+        <w:t>Com o projeto do Vivado aberto, localize o arquivo do Design Source. Para realizar a gravação na placa corretamente, é necessário comentar duas linhas que fazem referência à variável “saída_testbench”, neste caso, as linhas 13 e 3</w:t>
+      </w:r>
+      <w:r>
+        <w:rPr>
+          <w:rFonts w:ascii="Arial" w:hAnsi="Arial" w:cs="Arial"/>
+        </w:rPr>
+        <w:t>6</w:t>
+      </w:r>
+      <w:r>
+        <w:rPr>
+          <w:rFonts w:ascii="Arial" w:hAnsi="Arial" w:cs="Arial"/>
+        </w:rPr>
+        <w:t>. Para comentá-las, adicione dois hífens (--) no início das linhas. Ao final, salve o arquivo.</w:t>
       </w:r>
     </w:p>
     <w:p>
@@ -520,10 +480,11 @@
       <w:r>
         <w:rPr>
           <w:rFonts w:ascii="Arial" w:hAnsi="Arial" w:cs="Arial"/>
+          <w:noProof/>
         </w:rPr>
         <w:drawing>
-          <wp:inline distT="0" distB="0" distL="0" distR="0" wp14:anchorId="1C9B0843" wp14:editId="17C259CC">
-            <wp:extent cx="5400040" cy="2770505"/>
+          <wp:inline distT="0" distB="0" distL="0" distR="0" wp14:anchorId="1C9B0843" wp14:editId="1E93D2EC">
+            <wp:extent cx="5400040" cy="2711708"/>
             <wp:effectExtent l="0" t="0" r="0" b="0"/>
             <wp:docPr id="2045365044" name="Imagem 1"/>
             <wp:cNvGraphicFramePr>
@@ -533,11 +494,17 @@
               <a:graphicData uri="http://schemas.openxmlformats.org/drawingml/2006/picture">
                 <pic:pic xmlns:pic="http://schemas.openxmlformats.org/drawingml/2006/picture">
                   <pic:nvPicPr>
-                    <pic:cNvPr id="2045365044" name=""/>
+                    <pic:cNvPr id="2045365044" name="Imagem 1"/>
                     <pic:cNvPicPr/>
                   </pic:nvPicPr>
                   <pic:blipFill>
-                    <a:blip r:embed="rId6"/>
+                    <a:blip r:embed="rId6" cstate="print">
+                      <a:extLst>
+                        <a:ext uri="{28A0092B-C50C-407E-A947-70E740481C1C}">
+                          <a14:useLocalDpi xmlns:a14="http://schemas.microsoft.com/office/drawing/2010/main" val="0"/>
+                        </a:ext>
+                      </a:extLst>
+                    </a:blip>
                     <a:stretch>
                       <a:fillRect/>
                     </a:stretch>
@@ -545,7 +512,7 @@
                   <pic:spPr>
                     <a:xfrm>
                       <a:off x="0" y="0"/>
-                      <a:ext cx="5400040" cy="2770505"/>
+                      <a:ext cx="5400040" cy="2711708"/>
                     </a:xfrm>
                     <a:prstGeom prst="rect">
                       <a:avLst/>
@@ -569,32 +536,17 @@
       <w:r>
         <w:t xml:space="preserve">Figura </w:t>
       </w:r>
-      <w:r>
-        <w:fldChar w:fldCharType="begin"/>
-      </w:r>
-      <w:r>
-        <w:instrText xml:space="preserve"> SEQ Figura \* ARABIC </w:instrText>
-      </w:r>
-      <w:r>
-        <w:fldChar w:fldCharType="separate"/>
-      </w:r>
-      <w:r>
-        <w:rPr>
-          <w:noProof/>
-        </w:rPr>
-        <w:t>1</w:t>
-      </w:r>
-      <w:r>
-        <w:fldChar w:fldCharType="end"/>
-      </w:r>
-      <w:r>
-        <w:t xml:space="preserve"> - Design </w:t>
-      </w:r>
-      <w:proofErr w:type="spellStart"/>
-      <w:r>
-        <w:t>Source</w:t>
-      </w:r>
-      <w:proofErr w:type="spellEnd"/>
+      <w:fldSimple w:instr=" SEQ Figura \* ARABIC ">
+        <w:r>
+          <w:rPr>
+            <w:noProof/>
+          </w:rPr>
+          <w:t>1</w:t>
+        </w:r>
+      </w:fldSimple>
+      <w:r>
+        <w:t xml:space="preserve"> - Design Source</w:t>
+      </w:r>
     </w:p>
     <w:p>
       <w:pPr>
@@ -614,21 +566,19 @@
         <w:rPr>
           <w:rFonts w:ascii="Arial" w:hAnsi="Arial" w:cs="Arial"/>
         </w:rPr>
-        <w:t xml:space="preserve">, serão apresentados os procedimentos de síntese, implementação e geração do </w:t>
-      </w:r>
-      <w:proofErr w:type="spellStart"/>
-      <w:r>
-        <w:rPr>
-          <w:rFonts w:ascii="Arial" w:hAnsi="Arial" w:cs="Arial"/>
-        </w:rPr>
-        <w:t>bitestream</w:t>
-      </w:r>
-      <w:proofErr w:type="spellEnd"/>
-      <w:r>
-        <w:rPr>
-          <w:rFonts w:ascii="Arial" w:hAnsi="Arial" w:cs="Arial"/>
-        </w:rPr>
-        <w:t>, preparando o código para realizar a gravação no circuito.</w:t>
+        <w:t>, serão apresentados os procedimentos de síntese, implementação e geração d</w:t>
+      </w:r>
+      <w:r>
+        <w:rPr>
+          <w:rFonts w:ascii="Arial" w:hAnsi="Arial" w:cs="Arial"/>
+        </w:rPr>
+        <w:t>e</w:t>
+      </w:r>
+      <w:r>
+        <w:rPr>
+          <w:rFonts w:ascii="Arial" w:hAnsi="Arial" w:cs="Arial"/>
+        </w:rPr>
+        <w:t xml:space="preserve"> bitestream, preparando o código para realizar a gravação no circuito.</w:t>
       </w:r>
     </w:p>
     <w:p>
@@ -656,27 +606,7 @@
           <w:sz w:val="28"/>
           <w:szCs w:val="28"/>
         </w:rPr>
-        <w:t>2</w:t>
-      </w:r>
-      <w:r>
-        <w:rPr>
-          <w:rFonts w:ascii="Arial" w:hAnsi="Arial" w:cs="Arial"/>
-          <w:b/>
-          <w:bCs/>
-          <w:sz w:val="28"/>
-          <w:szCs w:val="28"/>
-        </w:rPr>
-        <w:t xml:space="preserve">) </w:t>
-      </w:r>
-      <w:r>
-        <w:rPr>
-          <w:rFonts w:ascii="Arial" w:hAnsi="Arial" w:cs="Arial"/>
-          <w:b/>
-          <w:bCs/>
-          <w:sz w:val="28"/>
-          <w:szCs w:val="28"/>
-        </w:rPr>
-        <w:t>SÍNTESE</w:t>
+        <w:t>2) SÍNTESE</w:t>
       </w:r>
     </w:p>
     <w:p>
@@ -697,35 +627,7 @@
         <w:rPr>
           <w:rFonts w:ascii="Arial" w:hAnsi="Arial" w:cs="Arial"/>
         </w:rPr>
-        <w:t>clique em “</w:t>
-      </w:r>
-      <w:proofErr w:type="spellStart"/>
-      <w:r>
-        <w:rPr>
-          <w:rFonts w:ascii="Arial" w:hAnsi="Arial" w:cs="Arial"/>
-        </w:rPr>
-        <w:t>Run</w:t>
-      </w:r>
-      <w:proofErr w:type="spellEnd"/>
-      <w:r>
-        <w:rPr>
-          <w:rFonts w:ascii="Arial" w:hAnsi="Arial" w:cs="Arial"/>
-        </w:rPr>
-        <w:t> </w:t>
-      </w:r>
-      <w:proofErr w:type="spellStart"/>
-      <w:r>
-        <w:rPr>
-          <w:rFonts w:ascii="Arial" w:hAnsi="Arial" w:cs="Arial"/>
-        </w:rPr>
-        <w:t>Synthesis</w:t>
-      </w:r>
-      <w:proofErr w:type="spellEnd"/>
-      <w:r>
-        <w:rPr>
-          <w:rFonts w:ascii="Arial" w:hAnsi="Arial" w:cs="Arial"/>
-        </w:rPr>
-        <w:t>”</w:t>
+        <w:t>clique em “Run Synthesis”</w:t>
       </w:r>
       <w:r>
         <w:rPr>
@@ -749,7 +651,13 @@
         <w:rPr>
           <w:rFonts w:ascii="Arial" w:hAnsi="Arial" w:cs="Arial"/>
         </w:rPr>
-        <w:t>nova janela para seguir com a etapa de implementação.</w:t>
+        <w:t>nova janela para seguir com a etapa de implementação</w:t>
+      </w:r>
+      <w:r>
+        <w:rPr>
+          <w:rFonts w:ascii="Arial" w:hAnsi="Arial" w:cs="Arial"/>
+        </w:rPr>
+        <w:t>:</w:t>
       </w:r>
     </w:p>
     <w:p>
@@ -762,6 +670,7 @@
           <w:rFonts w:ascii="Arial" w:hAnsi="Arial" w:cs="Arial"/>
           <w:b/>
           <w:bCs/>
+          <w:noProof/>
           <w:sz w:val="28"/>
           <w:szCs w:val="28"/>
         </w:rPr>
@@ -831,24 +740,14 @@
       <w:r>
         <w:t xml:space="preserve">Figura </w:t>
       </w:r>
-      <w:r>
-        <w:fldChar w:fldCharType="begin"/>
-      </w:r>
-      <w:r>
-        <w:instrText xml:space="preserve"> SEQ Figura \* ARABIC </w:instrText>
-      </w:r>
-      <w:r>
-        <w:fldChar w:fldCharType="separate"/>
-      </w:r>
-      <w:r>
-        <w:rPr>
-          <w:noProof/>
-        </w:rPr>
-        <w:t>2</w:t>
-      </w:r>
-      <w:r>
-        <w:fldChar w:fldCharType="end"/>
-      </w:r>
+      <w:fldSimple w:instr=" SEQ Figura \* ARABIC ">
+        <w:r>
+          <w:rPr>
+            <w:noProof/>
+          </w:rPr>
+          <w:t>2</w:t>
+        </w:r>
+      </w:fldSimple>
       <w:r>
         <w:t xml:space="preserve"> - Execução da síntese</w:t>
       </w:r>
@@ -884,27 +783,7 @@
           <w:sz w:val="28"/>
           <w:szCs w:val="28"/>
         </w:rPr>
-        <w:t>3</w:t>
-      </w:r>
-      <w:r>
-        <w:rPr>
-          <w:rFonts w:ascii="Arial" w:hAnsi="Arial" w:cs="Arial"/>
-          <w:b/>
-          <w:bCs/>
-          <w:sz w:val="28"/>
-          <w:szCs w:val="28"/>
-        </w:rPr>
-        <w:t xml:space="preserve">) </w:t>
-      </w:r>
-      <w:r>
-        <w:rPr>
-          <w:rFonts w:ascii="Arial" w:hAnsi="Arial" w:cs="Arial"/>
-          <w:b/>
-          <w:bCs/>
-          <w:sz w:val="28"/>
-          <w:szCs w:val="28"/>
-        </w:rPr>
-        <w:t>IMPLEMENTAÇÃO</w:t>
+        <w:t>3) IMPLEMENTAÇÃO</w:t>
       </w:r>
     </w:p>
     <w:p>
@@ -919,21 +798,7 @@
         <w:rPr>
           <w:rFonts w:ascii="Arial" w:hAnsi="Arial" w:cs="Arial"/>
         </w:rPr>
-        <w:t>Após a conclusão do </w:t>
-      </w:r>
-      <w:proofErr w:type="spellStart"/>
-      <w:r>
-        <w:rPr>
-          <w:rFonts w:ascii="Arial" w:hAnsi="Arial" w:cs="Arial"/>
-        </w:rPr>
-        <w:t>Synthesis</w:t>
-      </w:r>
-      <w:proofErr w:type="spellEnd"/>
-      <w:r>
-        <w:rPr>
-          <w:rFonts w:ascii="Arial" w:hAnsi="Arial" w:cs="Arial"/>
-        </w:rPr>
-        <w:t>, será aberta uma janela para iniciar a implementação. Clique em “OK”</w:t>
+        <w:t>Após a conclusão do Synthesis, será aberta uma janela para iniciar a implementação. Clique em “OK”</w:t>
       </w:r>
       <w:r>
         <w:rPr>
@@ -945,50 +810,14 @@
         <w:rPr>
           <w:rFonts w:ascii="Arial" w:hAnsi="Arial" w:cs="Arial"/>
         </w:rPr>
-        <w:t xml:space="preserve"> “</w:t>
-      </w:r>
-      <w:proofErr w:type="spellStart"/>
-      <w:r>
-        <w:rPr>
-          <w:rFonts w:ascii="Arial" w:hAnsi="Arial" w:cs="Arial"/>
-        </w:rPr>
-        <w:t>Run</w:t>
-      </w:r>
-      <w:proofErr w:type="spellEnd"/>
-      <w:r>
-        <w:rPr>
-          <w:rFonts w:ascii="Arial" w:hAnsi="Arial" w:cs="Arial"/>
-        </w:rPr>
-        <w:t> </w:t>
-      </w:r>
-      <w:proofErr w:type="spellStart"/>
-      <w:r>
-        <w:rPr>
-          <w:rFonts w:ascii="Arial" w:hAnsi="Arial" w:cs="Arial"/>
-        </w:rPr>
-        <w:t>Implementation</w:t>
-      </w:r>
-      <w:proofErr w:type="spellEnd"/>
-      <w:r>
-        <w:rPr>
-          <w:rFonts w:ascii="Arial" w:hAnsi="Arial" w:cs="Arial"/>
-        </w:rPr>
-        <w:t>” e depois “OK” novamente. Por fim, aguard</w:t>
-      </w:r>
-      <w:r>
-        <w:rPr>
-          <w:rFonts w:ascii="Arial" w:hAnsi="Arial" w:cs="Arial"/>
-        </w:rPr>
-        <w:t xml:space="preserve">e até que apareça uma nova janela para iniciar a etapa de geração do </w:t>
-      </w:r>
-      <w:proofErr w:type="spellStart"/>
-      <w:r>
-        <w:rPr>
-          <w:rFonts w:ascii="Arial" w:hAnsi="Arial" w:cs="Arial"/>
-        </w:rPr>
-        <w:t>Bitestream</w:t>
-      </w:r>
-      <w:proofErr w:type="spellEnd"/>
+        <w:t xml:space="preserve"> “Run Implementation” e depois “OK” novamente. Por fim, aguard</w:t>
+      </w:r>
+      <w:r>
+        <w:rPr>
+          <w:rFonts w:ascii="Arial" w:hAnsi="Arial" w:cs="Arial"/>
+        </w:rPr>
+        <w:t>e até que apareça uma nova janela para iniciar a etapa de geração do Bitestream</w:t>
+      </w:r>
       <w:r>
         <w:rPr>
           <w:rFonts w:ascii="Arial" w:hAnsi="Arial" w:cs="Arial"/>
@@ -1004,6 +833,7 @@
       <w:r>
         <w:rPr>
           <w:rFonts w:ascii="Arial" w:hAnsi="Arial" w:cs="Arial"/>
+          <w:noProof/>
         </w:rPr>
         <w:drawing>
           <wp:inline distT="0" distB="0" distL="0" distR="0" wp14:anchorId="61B9B974" wp14:editId="45779594">
@@ -1066,24 +896,14 @@
       <w:r>
         <w:t xml:space="preserve">Figura </w:t>
       </w:r>
-      <w:r>
-        <w:fldChar w:fldCharType="begin"/>
-      </w:r>
-      <w:r>
-        <w:instrText xml:space="preserve"> SEQ Figura \* ARABIC </w:instrText>
-      </w:r>
-      <w:r>
-        <w:fldChar w:fldCharType="separate"/>
-      </w:r>
-      <w:r>
-        <w:rPr>
-          <w:noProof/>
-        </w:rPr>
-        <w:t>3</w:t>
-      </w:r>
-      <w:r>
-        <w:fldChar w:fldCharType="end"/>
-      </w:r>
+      <w:fldSimple w:instr=" SEQ Figura \* ARABIC ">
+        <w:r>
+          <w:rPr>
+            <w:noProof/>
+          </w:rPr>
+          <w:t>3</w:t>
+        </w:r>
+      </w:fldSimple>
       <w:r>
         <w:t xml:space="preserve"> - Execução da implementação</w:t>
       </w:r>
@@ -1139,27 +959,7 @@
           <w:sz w:val="28"/>
           <w:szCs w:val="28"/>
         </w:rPr>
-        <w:t>4</w:t>
-      </w:r>
-      <w:r>
-        <w:rPr>
-          <w:rFonts w:ascii="Arial" w:hAnsi="Arial" w:cs="Arial"/>
-          <w:b/>
-          <w:bCs/>
-          <w:sz w:val="28"/>
-          <w:szCs w:val="28"/>
-        </w:rPr>
-        <w:t xml:space="preserve">) </w:t>
-      </w:r>
-      <w:r>
-        <w:rPr>
-          <w:rFonts w:ascii="Arial" w:hAnsi="Arial" w:cs="Arial"/>
-          <w:b/>
-          <w:bCs/>
-          <w:sz w:val="28"/>
-          <w:szCs w:val="28"/>
-        </w:rPr>
-        <w:t>GERAÇÃO DO BITESTREAM</w:t>
+        <w:t>4) GERAÇÃO DO BITESTREAM</w:t>
       </w:r>
     </w:p>
     <w:p>
@@ -1174,35 +974,7 @@
         <w:rPr>
           <w:rFonts w:ascii="Arial" w:hAnsi="Arial" w:cs="Arial"/>
         </w:rPr>
-        <w:t>Quando a implementação for concluída, será aberta uma nova janela. Selecione a opção “</w:t>
-      </w:r>
-      <w:proofErr w:type="spellStart"/>
-      <w:r>
-        <w:rPr>
-          <w:rFonts w:ascii="Arial" w:hAnsi="Arial" w:cs="Arial"/>
-        </w:rPr>
-        <w:t>Generate</w:t>
-      </w:r>
-      <w:proofErr w:type="spellEnd"/>
-      <w:r>
-        <w:rPr>
-          <w:rFonts w:ascii="Arial" w:hAnsi="Arial" w:cs="Arial"/>
-        </w:rPr>
-        <w:t> </w:t>
-      </w:r>
-      <w:proofErr w:type="spellStart"/>
-      <w:r>
-        <w:rPr>
-          <w:rFonts w:ascii="Arial" w:hAnsi="Arial" w:cs="Arial"/>
-        </w:rPr>
-        <w:t>Bitstream</w:t>
-      </w:r>
-      <w:proofErr w:type="spellEnd"/>
-      <w:r>
-        <w:rPr>
-          <w:rFonts w:ascii="Arial" w:hAnsi="Arial" w:cs="Arial"/>
-        </w:rPr>
-        <w:t>”, clique em “OK” e depois “OK” novamente</w:t>
+        <w:t>Quando a implementação for concluída, será aberta uma nova janela. Selecione a opção “Generate Bitstream”, clique em “OK” e depois “OK” novamente</w:t>
       </w:r>
       <w:r>
         <w:rPr>
@@ -1225,6 +997,7 @@
       <w:r>
         <w:rPr>
           <w:rFonts w:ascii="Arial" w:hAnsi="Arial" w:cs="Arial"/>
+          <w:noProof/>
         </w:rPr>
         <w:drawing>
           <wp:inline distT="0" distB="0" distL="0" distR="0" wp14:anchorId="7CDBF2C5" wp14:editId="4C28FCB5">
@@ -1287,32 +1060,17 @@
       <w:r>
         <w:t xml:space="preserve">Figura </w:t>
       </w:r>
-      <w:r>
-        <w:fldChar w:fldCharType="begin"/>
-      </w:r>
-      <w:r>
-        <w:instrText xml:space="preserve"> SEQ Figura \* ARABIC </w:instrText>
-      </w:r>
-      <w:r>
-        <w:fldChar w:fldCharType="separate"/>
-      </w:r>
-      <w:r>
-        <w:rPr>
-          <w:noProof/>
-        </w:rPr>
-        <w:t>4</w:t>
-      </w:r>
-      <w:r>
-        <w:fldChar w:fldCharType="end"/>
-      </w:r>
-      <w:r>
-        <w:t xml:space="preserve"> - Geração do </w:t>
-      </w:r>
-      <w:proofErr w:type="spellStart"/>
-      <w:r>
-        <w:t>bitestream</w:t>
-      </w:r>
-      <w:proofErr w:type="spellEnd"/>
+      <w:fldSimple w:instr=" SEQ Figura \* ARABIC ">
+        <w:r>
+          <w:rPr>
+            <w:noProof/>
+          </w:rPr>
+          <w:t>4</w:t>
+        </w:r>
+      </w:fldSimple>
+      <w:r>
+        <w:t xml:space="preserve"> - Geração do bitestream</w:t>
+      </w:r>
     </w:p>
     <w:p>
       <w:pPr>
@@ -1341,27 +1099,7 @@
           <w:sz w:val="28"/>
           <w:szCs w:val="28"/>
         </w:rPr>
-        <w:t>5</w:t>
-      </w:r>
-      <w:r>
-        <w:rPr>
-          <w:rFonts w:ascii="Arial" w:hAnsi="Arial" w:cs="Arial"/>
-          <w:b/>
-          <w:bCs/>
-          <w:sz w:val="28"/>
-          <w:szCs w:val="28"/>
-        </w:rPr>
-        <w:t xml:space="preserve">) </w:t>
-      </w:r>
-      <w:r>
-        <w:rPr>
-          <w:rFonts w:ascii="Arial" w:hAnsi="Arial" w:cs="Arial"/>
-          <w:b/>
-          <w:bCs/>
-          <w:sz w:val="28"/>
-          <w:szCs w:val="28"/>
-        </w:rPr>
-        <w:t>CONEXÃO DA PLACA</w:t>
+        <w:t>5) CONEXÃO DA PLACA</w:t>
       </w:r>
     </w:p>
     <w:p>
@@ -1450,24 +1188,14 @@
       <w:r>
         <w:t xml:space="preserve">Figura </w:t>
       </w:r>
-      <w:r>
-        <w:fldChar w:fldCharType="begin"/>
-      </w:r>
-      <w:r>
-        <w:instrText xml:space="preserve"> SEQ Figura \* ARABIC </w:instrText>
-      </w:r>
-      <w:r>
-        <w:fldChar w:fldCharType="separate"/>
-      </w:r>
-      <w:r>
-        <w:rPr>
-          <w:noProof/>
-        </w:rPr>
-        <w:t>5</w:t>
-      </w:r>
-      <w:r>
-        <w:fldChar w:fldCharType="end"/>
-      </w:r>
+      <w:fldSimple w:instr=" SEQ Figura \* ARABIC ">
+        <w:r>
+          <w:rPr>
+            <w:noProof/>
+          </w:rPr>
+          <w:t>5</w:t>
+        </w:r>
+      </w:fldSimple>
       <w:r>
         <w:t xml:space="preserve"> - Esquema da placa FPGA</w:t>
       </w:r>
@@ -1564,24 +1292,14 @@
       <w:r>
         <w:t xml:space="preserve">Figura </w:t>
       </w:r>
-      <w:r>
-        <w:fldChar w:fldCharType="begin"/>
-      </w:r>
-      <w:r>
-        <w:instrText xml:space="preserve"> SEQ Figura \* ARABIC </w:instrText>
-      </w:r>
-      <w:r>
-        <w:fldChar w:fldCharType="separate"/>
-      </w:r>
-      <w:r>
-        <w:rPr>
-          <w:noProof/>
-        </w:rPr>
-        <w:t>6</w:t>
-      </w:r>
-      <w:r>
-        <w:fldChar w:fldCharType="end"/>
-      </w:r>
+      <w:fldSimple w:instr=" SEQ Figura \* ARABIC ">
+        <w:r>
+          <w:rPr>
+            <w:noProof/>
+          </w:rPr>
+          <w:t>6</w:t>
+        </w:r>
+      </w:fldSimple>
       <w:r>
         <w:t xml:space="preserve"> - Estado inicial da placa FPGA</w:t>
       </w:r>
@@ -1613,27 +1331,7 @@
           <w:sz w:val="28"/>
           <w:szCs w:val="28"/>
         </w:rPr>
-        <w:t>6</w:t>
-      </w:r>
-      <w:r>
-        <w:rPr>
-          <w:rFonts w:ascii="Arial" w:hAnsi="Arial" w:cs="Arial"/>
-          <w:b/>
-          <w:bCs/>
-          <w:sz w:val="28"/>
-          <w:szCs w:val="28"/>
-        </w:rPr>
-        <w:t xml:space="preserve">) </w:t>
-      </w:r>
-      <w:r>
-        <w:rPr>
-          <w:rFonts w:ascii="Arial" w:hAnsi="Arial" w:cs="Arial"/>
-          <w:b/>
-          <w:bCs/>
-          <w:sz w:val="28"/>
-          <w:szCs w:val="28"/>
-        </w:rPr>
-        <w:t>PROGRAMAÇÃO</w:t>
+        <w:t>6) PROGRAMAÇÃO</w:t>
       </w:r>
     </w:p>
     <w:p>
@@ -1648,21 +1346,7 @@
         <w:rPr>
           <w:rFonts w:ascii="Arial" w:hAnsi="Arial" w:cs="Arial"/>
         </w:rPr>
-        <w:t>No menu Flow </w:t>
-      </w:r>
-      <w:proofErr w:type="spellStart"/>
-      <w:r>
-        <w:rPr>
-          <w:rFonts w:ascii="Arial" w:hAnsi="Arial" w:cs="Arial"/>
-        </w:rPr>
-        <w:t>Navigator</w:t>
-      </w:r>
-      <w:proofErr w:type="spellEnd"/>
-      <w:r>
-        <w:rPr>
-          <w:rFonts w:ascii="Arial" w:hAnsi="Arial" w:cs="Arial"/>
-        </w:rPr>
-        <w:t>, acesse “PROGRAM AND DEBUG” &gt; “Open Hardware Manager”, clique no item “Open Target” &gt; “Auto Connect” e selecione o dispositivo que está conectado no computador: </w:t>
+        <w:t>No menu Flow Navigator, acesse “PROGRAM AND DEBUG” &gt; “Open Hardware Manager”, clique no item “Open Target” &gt; “Auto Connect”: </w:t>
       </w:r>
     </w:p>
     <w:p>
@@ -1673,6 +1357,7 @@
       <w:r>
         <w:rPr>
           <w:rFonts w:ascii="Arial" w:hAnsi="Arial" w:cs="Arial"/>
+          <w:noProof/>
         </w:rPr>
         <w:drawing>
           <wp:inline distT="0" distB="0" distL="0" distR="0" wp14:anchorId="46EDBC6E" wp14:editId="2D3B8FAC">
@@ -1737,24 +1422,14 @@
       <w:r>
         <w:t xml:space="preserve">Figura </w:t>
       </w:r>
-      <w:r>
-        <w:fldChar w:fldCharType="begin"/>
-      </w:r>
-      <w:r>
-        <w:instrText xml:space="preserve"> SEQ Figura \* ARABIC </w:instrText>
-      </w:r>
-      <w:r>
-        <w:fldChar w:fldCharType="separate"/>
-      </w:r>
-      <w:r>
-        <w:rPr>
-          <w:noProof/>
-        </w:rPr>
-        <w:t>7</w:t>
-      </w:r>
-      <w:r>
-        <w:fldChar w:fldCharType="end"/>
-      </w:r>
+      <w:fldSimple w:instr=" SEQ Figura \* ARABIC ">
+        <w:r>
+          <w:rPr>
+            <w:noProof/>
+          </w:rPr>
+          <w:t>7</w:t>
+        </w:r>
+      </w:fldSimple>
       <w:r>
         <w:t xml:space="preserve"> - Programação da placa FPGA</w:t>
       </w:r>
@@ -1785,21 +1460,7 @@
         <w:rPr>
           <w:rFonts w:ascii="Arial" w:hAnsi="Arial" w:cs="Arial"/>
         </w:rPr>
-        <w:t>Em seguida, na parte superior da tela, clique no item “</w:t>
-      </w:r>
-      <w:proofErr w:type="spellStart"/>
-      <w:r>
-        <w:rPr>
-          <w:rFonts w:ascii="Arial" w:hAnsi="Arial" w:cs="Arial"/>
-        </w:rPr>
-        <w:t>Program</w:t>
-      </w:r>
-      <w:proofErr w:type="spellEnd"/>
-      <w:r>
-        <w:rPr>
-          <w:rFonts w:ascii="Arial" w:hAnsi="Arial" w:cs="Arial"/>
-        </w:rPr>
-        <w:t xml:space="preserve"> Device” e depois em “OK”. Com isso, o código VHDL será passado </w:t>
+        <w:t xml:space="preserve">Em seguida, na parte superior da tela, clique no item “Program Device” e depois em “OK”. Com isso, o código VHDL será passado </w:t>
       </w:r>
       <w:r>
         <w:rPr>
@@ -1811,14 +1472,7 @@
         <w:rPr>
           <w:rFonts w:ascii="Arial" w:hAnsi="Arial" w:cs="Arial"/>
         </w:rPr>
-        <w:t xml:space="preserve"> placa, que já irá operar de acordo com a lógica do modulador. Para ter certeza de que o código </w:t>
-      </w:r>
-      <w:r>
-        <w:rPr>
-          <w:rFonts w:ascii="Arial" w:hAnsi="Arial" w:cs="Arial"/>
-        </w:rPr>
-        <w:lastRenderedPageBreak/>
-        <w:t>já foi gravado, verifique se o display de dígitos numéricos do FPGA ficou levemente apagado, parando de contar.</w:t>
+        <w:t xml:space="preserve"> placa, que já irá operar de acordo com a lógica do modulador. Para ter certeza de que o código já foi gravado, verifique se o display de dígitos numéricos do FPGA ficou levemente apagado, parando de contar.</w:t>
       </w:r>
     </w:p>
     <w:p>
@@ -1874,17 +1528,7 @@
           <w:sz w:val="28"/>
           <w:szCs w:val="28"/>
         </w:rPr>
-        <w:t xml:space="preserve">) </w:t>
-      </w:r>
-      <w:r>
-        <w:rPr>
-          <w:rFonts w:ascii="Arial" w:hAnsi="Arial" w:cs="Arial"/>
-          <w:b/>
-          <w:bCs/>
-          <w:sz w:val="28"/>
-          <w:szCs w:val="28"/>
-        </w:rPr>
-        <w:t>MAPEAMENTO DE USO DA PLACA</w:t>
+        <w:t>) MAPEAMENTO DE USO DA PLACA</w:t>
       </w:r>
     </w:p>
     <w:p>
@@ -1917,7 +1561,43 @@
         <w:rPr>
           <w:rFonts w:ascii="Arial" w:hAnsi="Arial" w:cs="Arial"/>
         </w:rPr>
-        <w:t xml:space="preserve"> (os blocos pretos na parte inferior)</w:t>
+        <w:t xml:space="preserve"> (</w:t>
+      </w:r>
+      <w:r>
+        <w:rPr>
+          <w:rFonts w:ascii="Arial" w:hAnsi="Arial" w:cs="Arial"/>
+        </w:rPr>
+        <w:t>a fileira horizontal de</w:t>
+      </w:r>
+      <w:r>
+        <w:rPr>
+          <w:rFonts w:ascii="Arial" w:hAnsi="Arial" w:cs="Arial"/>
+        </w:rPr>
+        <w:t xml:space="preserve"> </w:t>
+      </w:r>
+      <w:r>
+        <w:rPr>
+          <w:rFonts w:ascii="Arial" w:hAnsi="Arial" w:cs="Arial"/>
+        </w:rPr>
+        <w:t>“</w:t>
+      </w:r>
+      <w:r>
+        <w:rPr>
+          <w:rFonts w:ascii="Arial" w:hAnsi="Arial" w:cs="Arial"/>
+        </w:rPr>
+        <w:t>blocos pretos</w:t>
+      </w:r>
+      <w:r>
+        <w:rPr>
+          <w:rFonts w:ascii="Arial" w:hAnsi="Arial" w:cs="Arial"/>
+        </w:rPr>
+        <w:t>”</w:t>
+      </w:r>
+      <w:r>
+        <w:rPr>
+          <w:rFonts w:ascii="Arial" w:hAnsi="Arial" w:cs="Arial"/>
+        </w:rPr>
+        <w:t xml:space="preserve"> na parte inferior)</w:t>
       </w:r>
       <w:r>
         <w:rPr>
@@ -2009,24 +1689,14 @@
       <w:r>
         <w:t xml:space="preserve">Figura </w:t>
       </w:r>
-      <w:r>
-        <w:fldChar w:fldCharType="begin"/>
-      </w:r>
-      <w:r>
-        <w:instrText xml:space="preserve"> SEQ Figura \* ARABIC </w:instrText>
-      </w:r>
-      <w:r>
-        <w:fldChar w:fldCharType="separate"/>
-      </w:r>
-      <w:r>
-        <w:rPr>
-          <w:noProof/>
-        </w:rPr>
-        <w:t>8</w:t>
-      </w:r>
-      <w:r>
-        <w:fldChar w:fldCharType="end"/>
-      </w:r>
+      <w:fldSimple w:instr=" SEQ Figura \* ARABIC ">
+        <w:r>
+          <w:rPr>
+            <w:noProof/>
+          </w:rPr>
+          <w:t>8</w:t>
+        </w:r>
+      </w:fldSimple>
       <w:r>
         <w:t xml:space="preserve"> - Esquema da placa FPGA</w:t>
       </w:r>
@@ -2043,25 +1713,7 @@
         <w:rPr>
           <w:rFonts w:ascii="Arial" w:hAnsi="Arial" w:cs="Arial"/>
         </w:rPr>
-        <w:t xml:space="preserve">Em ambos os casos, </w:t>
-      </w:r>
-      <w:r>
-        <w:rPr>
-          <w:rFonts w:ascii="Arial" w:hAnsi="Arial" w:cs="Arial"/>
-        </w:rPr>
-        <w:t>os bits mais significativos</w:t>
-      </w:r>
-      <w:r>
-        <w:rPr>
-          <w:rFonts w:ascii="Arial" w:hAnsi="Arial" w:cs="Arial"/>
-        </w:rPr>
-        <w:t xml:space="preserve"> estão</w:t>
-      </w:r>
-      <w:r>
-        <w:rPr>
-          <w:rFonts w:ascii="Arial" w:hAnsi="Arial" w:cs="Arial"/>
-        </w:rPr>
-        <w:t xml:space="preserve"> à esquerda e os menos significativos à direita</w:t>
+        <w:t>Em ambos os casos, os bits mais significativos estão à esquerda e os menos significativos à direita</w:t>
       </w:r>
       <w:r>
         <w:rPr>
@@ -2098,27 +1750,7 @@
           <w:sz w:val="28"/>
           <w:szCs w:val="28"/>
         </w:rPr>
-        <w:t>8</w:t>
-      </w:r>
-      <w:r>
-        <w:rPr>
-          <w:rFonts w:ascii="Arial" w:hAnsi="Arial" w:cs="Arial"/>
-          <w:b/>
-          <w:bCs/>
-          <w:sz w:val="28"/>
-          <w:szCs w:val="28"/>
-        </w:rPr>
-        <w:t xml:space="preserve">) </w:t>
-      </w:r>
-      <w:r>
-        <w:rPr>
-          <w:rFonts w:ascii="Arial" w:hAnsi="Arial" w:cs="Arial"/>
-          <w:b/>
-          <w:bCs/>
-          <w:sz w:val="28"/>
-          <w:szCs w:val="28"/>
-        </w:rPr>
-        <w:t>COMO TESTAR</w:t>
+        <w:t>8) COMO TESTAR</w:t>
       </w:r>
     </w:p>
     <w:p>
@@ -2148,7 +1780,19 @@
         <w:rPr>
           <w:rFonts w:ascii="Arial" w:hAnsi="Arial" w:cs="Arial"/>
         </w:rPr>
-        <w:t>Como exemplo, modifique os switches para que representam a entrada da sequência “</w:t>
+        <w:t>Como exemplo, modifique os switches para que represent</w:t>
+      </w:r>
+      <w:r>
+        <w:rPr>
+          <w:rFonts w:ascii="Arial" w:hAnsi="Arial" w:cs="Arial"/>
+        </w:rPr>
+        <w:t>e</w:t>
+      </w:r>
+      <w:r>
+        <w:rPr>
+          <w:rFonts w:ascii="Arial" w:hAnsi="Arial" w:cs="Arial"/>
+        </w:rPr>
+        <w:t>m a entrada da sequência “</w:t>
       </w:r>
       <w:r>
         <w:rPr>
@@ -2237,24 +1881,14 @@
       <w:r>
         <w:t xml:space="preserve">Figura </w:t>
       </w:r>
-      <w:r>
-        <w:fldChar w:fldCharType="begin"/>
-      </w:r>
-      <w:r>
-        <w:instrText xml:space="preserve"> SEQ Figura \* ARABIC </w:instrText>
-      </w:r>
-      <w:r>
-        <w:fldChar w:fldCharType="separate"/>
-      </w:r>
-      <w:r>
-        <w:rPr>
-          <w:noProof/>
-        </w:rPr>
-        <w:t>9</w:t>
-      </w:r>
-      <w:r>
-        <w:fldChar w:fldCharType="end"/>
-      </w:r>
+      <w:fldSimple w:instr=" SEQ Figura \* ARABIC ">
+        <w:r>
+          <w:rPr>
+            <w:noProof/>
+          </w:rPr>
+          <w:t>9</w:t>
+        </w:r>
+      </w:fldSimple>
       <w:r>
         <w:t xml:space="preserve"> - Placa FPGA com modulação NRZ-L</w:t>
       </w:r>
@@ -3111,6 +2745,7 @@
   <w:style w:type="character" w:default="1" w:styleId="Fontepargpadro">
     <w:name w:val="Default Paragraph Font"/>
     <w:uiPriority w:val="1"/>
+    <w:semiHidden/>
     <w:unhideWhenUsed/>
   </w:style>
   <w:style w:type="table" w:default="1" w:styleId="Tabelanormal">

</xml_diff>

<commit_message>
fix: corrige tutorial da placa NRZ-L
</commit_message>
<xml_diff>
--- a/nrz_l/docs/tutorial_placa.docx
+++ b/nrz_l/docs/tutorial_placa.docx
@@ -404,7 +404,19 @@
         <w:rPr>
           <w:rFonts w:ascii="Arial" w:hAnsi="Arial" w:cs="Arial"/>
         </w:rPr>
-        <w:t>Projeto baixado do repositório no GitHub, conforme orientado no arquivo “tutorial_simulacao.pdf”.</w:t>
+        <w:t>Projeto</w:t>
+      </w:r>
+      <w:r>
+        <w:rPr>
+          <w:rFonts w:ascii="Arial" w:hAnsi="Arial" w:cs="Arial"/>
+        </w:rPr>
+        <w:t xml:space="preserve"> do modulador NRZ-L</w:t>
+      </w:r>
+      <w:r>
+        <w:rPr>
+          <w:rFonts w:ascii="Arial" w:hAnsi="Arial" w:cs="Arial"/>
+        </w:rPr>
+        <w:t xml:space="preserve"> baixado do repositório no GitHub, conforme orientado no arquivo “tutorial_simulacao.pdf”.</w:t>
       </w:r>
     </w:p>
     <w:p>

</xml_diff>